<commit_message>
Update Bluey instructions with purchase link
</commit_message>
<xml_diff>
--- a/Toy_Instructions/Sound_Movement_Light/Moose_Toys_Talking_Bluey_Bingo_Plush/Moose_Toys_Talking_Bluey_Bingo_Plush_Maker_Guide.docx
+++ b/Toy_Instructions/Sound_Movement_Light/Moose_Toys_Talking_Bluey_Bingo_Plush/Moose_Toys_Talking_Bluey_Bingo_Plush_Maker_Guide.docx
@@ -244,6 +244,20 @@
             <w:r>
               <w:t>lush Toy</w:t>
             </w:r>
+            <w:r>
+              <w:t xml:space="preserve"> (</w:t>
+            </w:r>
+            <w:hyperlink r:id="rId14" w:history="1">
+              <w:r>
+                <w:rPr>
+                  <w:rStyle w:val="Hyperlink"/>
+                </w:rPr>
+                <w:t>Bluey – Amazon</w:t>
+              </w:r>
+            </w:hyperlink>
+            <w:r>
+              <w:t>)</w:t>
+            </w:r>
           </w:p>
           <w:p>
             <w:pPr>
@@ -290,7 +304,7 @@
             <w:r>
               <w:t xml:space="preserve">Refer to the </w:t>
             </w:r>
-            <w:hyperlink r:id="rId14" w:history="1">
+            <w:hyperlink r:id="rId15" w:history="1">
               <w:r>
                 <w:rPr>
                   <w:rStyle w:val="Hyperlink"/>
@@ -360,7 +374,7 @@
                           <pic:cNvPicPr/>
                         </pic:nvPicPr>
                         <pic:blipFill>
-                          <a:blip r:embed="rId15" cstate="print">
+                          <a:blip r:embed="rId16" cstate="print">
                             <a:extLst>
                               <a:ext uri="{28A0092B-C50C-407E-A947-70E740481C1C}">
                                 <a14:useLocalDpi xmlns:a14="http://schemas.microsoft.com/office/drawing/2010/main" val="0"/>
@@ -428,7 +442,7 @@
                           <pic:cNvPicPr/>
                         </pic:nvPicPr>
                         <pic:blipFill rotWithShape="1">
-                          <a:blip r:embed="rId16" cstate="print">
+                          <a:blip r:embed="rId17" cstate="print">
                             <a:extLst>
                               <a:ext uri="{28A0092B-C50C-407E-A947-70E740481C1C}">
                                 <a14:useLocalDpi xmlns:a14="http://schemas.microsoft.com/office/drawing/2010/main" val="0"/>
@@ -614,7 +628,6 @@
         <w:t>ssembly Instructions</w:t>
       </w:r>
     </w:p>
-    <w:p/>
     <w:tbl>
       <w:tblPr>
         <w:tblStyle w:val="TableGrid"/>
@@ -883,7 +896,7 @@
                           <pic:cNvPicPr/>
                         </pic:nvPicPr>
                         <pic:blipFill rotWithShape="1">
-                          <a:blip r:embed="rId17" cstate="print">
+                          <a:blip r:embed="rId18" cstate="print">
                             <a:extLst>
                               <a:ext uri="{28A0092B-C50C-407E-A947-70E740481C1C}">
                                 <a14:useLocalDpi xmlns:a14="http://schemas.microsoft.com/office/drawing/2010/main" val="0"/>
@@ -1364,7 +1377,7 @@
                           <pic:cNvPicPr/>
                         </pic:nvPicPr>
                         <pic:blipFill rotWithShape="1">
-                          <a:blip r:embed="rId18" cstate="print">
+                          <a:blip r:embed="rId19" cstate="print">
                             <a:extLst>
                               <a:ext uri="{28A0092B-C50C-407E-A947-70E740481C1C}">
                                 <a14:useLocalDpi xmlns:a14="http://schemas.microsoft.com/office/drawing/2010/main" val="0"/>
@@ -1429,23 +1442,7 @@
                 <w:szCs w:val="24"/>
               </w:rPr>
               <w:lastRenderedPageBreak/>
-              <w:t xml:space="preserve">Using a </w:t>
-            </w:r>
-            <w:proofErr w:type="gramStart"/>
-            <w:r>
-              <w:rPr>
-                <w:sz w:val="24"/>
-                <w:szCs w:val="24"/>
-              </w:rPr>
-              <w:t>1/8 inch</w:t>
-            </w:r>
-            <w:proofErr w:type="gramEnd"/>
-            <w:r>
-              <w:rPr>
-                <w:sz w:val="24"/>
-                <w:szCs w:val="24"/>
-              </w:rPr>
-              <w:t xml:space="preserve"> drill bit, you will drill a hole for your mono cable. The mono </w:t>
+              <w:t xml:space="preserve">Using a 1/8 inch drill bit, you will drill a hole for your mono cable. The mono </w:t>
             </w:r>
             <w:r>
               <w:rPr>
@@ -1679,7 +1676,7 @@
                           <pic:cNvPicPr/>
                         </pic:nvPicPr>
                         <pic:blipFill>
-                          <a:blip r:embed="rId19" cstate="print">
+                          <a:blip r:embed="rId20" cstate="print">
                             <a:extLst>
                               <a:ext uri="{28A0092B-C50C-407E-A947-70E740481C1C}">
                                 <a14:useLocalDpi xmlns:a14="http://schemas.microsoft.com/office/drawing/2010/main" val="0"/>
@@ -1717,7 +1714,7 @@
         <w:trPr>
           <w:gridAfter w:val="1"/>
           <w:wAfter w:w="28" w:type="dxa"/>
-          <w:trHeight w:val="3510"/>
+          <w:trHeight w:val="3144"/>
         </w:trPr>
         <w:tc>
           <w:tcPr>
@@ -1774,27 +1771,7 @@
                 <w:sz w:val="24"/>
                 <w:szCs w:val="24"/>
               </w:rPr>
-              <w:t xml:space="preserve"> </w:t>
-            </w:r>
-            <w:proofErr w:type="gramStart"/>
-            <w:r>
-              <w:rPr>
-                <w:rFonts w:ascii="Calibri" w:eastAsia="Calibri" w:hAnsi="Calibri" w:cs="Calibri"/>
-                <w:color w:val="000000" w:themeColor="text1"/>
-                <w:sz w:val="24"/>
-                <w:szCs w:val="24"/>
-              </w:rPr>
-              <w:t>end</w:t>
-            </w:r>
-            <w:proofErr w:type="gramEnd"/>
-            <w:r>
-              <w:rPr>
-                <w:rFonts w:ascii="Calibri" w:eastAsia="Calibri" w:hAnsi="Calibri" w:cs="Calibri"/>
-                <w:color w:val="000000" w:themeColor="text1"/>
-                <w:sz w:val="24"/>
-                <w:szCs w:val="24"/>
-              </w:rPr>
-              <w:t xml:space="preserve"> and t</w:t>
+              <w:t xml:space="preserve"> end and t</w:t>
             </w:r>
             <w:r>
               <w:rPr>
@@ -1817,7 +1794,17 @@
           </w:p>
           <w:p>
             <w:pPr>
-              <w:pStyle w:val="ListParagraph"/>
+              <w:rPr>
+                <w:rFonts w:ascii="Calibri" w:eastAsia="Calibri" w:hAnsi="Calibri" w:cs="Calibri"/>
+                <w:color w:val="000000" w:themeColor="text1"/>
+                <w:sz w:val="24"/>
+                <w:szCs w:val="24"/>
+              </w:rPr>
+            </w:pPr>
+          </w:p>
+          <w:p>
+            <w:pPr>
+              <w:ind w:left="360"/>
               <w:rPr>
                 <w:sz w:val="24"/>
                 <w:szCs w:val="24"/>
@@ -1849,22 +1836,17 @@
             <w:gridSpan w:val="2"/>
           </w:tcPr>
           <w:p>
+            <w:pPr>
+              <w:jc w:val="center"/>
+            </w:pPr>
             <w:r>
               <w:rPr>
                 <w:noProof/>
               </w:rPr>
               <w:drawing>
-                <wp:anchor distT="0" distB="0" distL="114300" distR="114300" simplePos="0" relativeHeight="251658240" behindDoc="1" locked="0" layoutInCell="1" allowOverlap="1" wp14:anchorId="4F39A8B4" wp14:editId="3EA9BA3A">
-                  <wp:simplePos x="0" y="0"/>
-                  <wp:positionH relativeFrom="column">
-                    <wp:posOffset>509270</wp:posOffset>
-                  </wp:positionH>
-                  <wp:positionV relativeFrom="paragraph">
-                    <wp:posOffset>145415</wp:posOffset>
-                  </wp:positionV>
+                <wp:inline distT="0" distB="0" distL="0" distR="0" wp14:anchorId="4F39A8B4" wp14:editId="1C74AA29">
                   <wp:extent cx="2292350" cy="1874569"/>
-                  <wp:effectExtent l="133350" t="114300" r="127000" b="163830"/>
-                  <wp:wrapNone/>
+                  <wp:effectExtent l="0" t="0" r="0" b="0"/>
                   <wp:docPr id="1656168231" name="Picture 1656168231"/>
                   <wp:cNvGraphicFramePr>
                     <a:graphicFrameLocks xmlns:a="http://schemas.openxmlformats.org/drawingml/2006/main" noChangeAspect="1"/>
@@ -1877,7 +1859,7 @@
                           <pic:cNvPicPr/>
                         </pic:nvPicPr>
                         <pic:blipFill>
-                          <a:blip r:embed="rId20" cstate="print">
+                          <a:blip r:embed="rId21" cstate="print">
                             <a:extLst>
                               <a:ext uri="{28A0092B-C50C-407E-A947-70E740481C1C}">
                                 <a14:useLocalDpi xmlns:a14="http://schemas.microsoft.com/office/drawing/2010/main" val="0"/>
@@ -1903,35 +1885,15 @@
                             </a:srgbClr>
                           </a:solidFill>
                           <a:ln w="88900" cap="sq">
-                            <a:solidFill>
-                              <a:srgbClr val="FFFFFF"/>
-                            </a:solidFill>
+                            <a:noFill/>
                             <a:miter lim="800000"/>
                           </a:ln>
-                          <a:effectLst>
-                            <a:outerShdw blurRad="55000" dist="18000" dir="5400000" algn="tl" rotWithShape="0">
-                              <a:srgbClr val="000000">
-                                <a:alpha val="40000"/>
-                              </a:srgbClr>
-                            </a:outerShdw>
-                          </a:effectLst>
-                          <a:scene3d>
-                            <a:camera prst="orthographicFront"/>
-                            <a:lightRig rig="twoPt" dir="t">
-                              <a:rot lat="0" lon="0" rev="7200000"/>
-                            </a:lightRig>
-                          </a:scene3d>
-                          <a:sp3d>
-                            <a:bevelT w="25400" h="19050"/>
-                            <a:contourClr>
-                              <a:srgbClr val="FFFFFF"/>
-                            </a:contourClr>
-                          </a:sp3d>
+                          <a:effectLst/>
                         </pic:spPr>
                       </pic:pic>
                     </a:graphicData>
                   </a:graphic>
-                </wp:anchor>
+                </wp:inline>
               </w:drawing>
             </w:r>
           </w:p>
@@ -2073,77 +2035,11 @@
           </w:tcPr>
           <w:p>
             <w:pPr>
+              <w:jc w:val="center"/>
               <w:rPr>
                 <w:noProof/>
               </w:rPr>
             </w:pPr>
-            <w:r>
-              <w:rPr>
-                <w:noProof/>
-              </w:rPr>
-              <w:drawing>
-                <wp:anchor distT="0" distB="0" distL="114300" distR="114300" simplePos="0" relativeHeight="251658255" behindDoc="0" locked="0" layoutInCell="1" allowOverlap="1" wp14:anchorId="1E735AD8" wp14:editId="4BD83D52">
-                  <wp:simplePos x="0" y="0"/>
-                  <wp:positionH relativeFrom="column">
-                    <wp:posOffset>829310</wp:posOffset>
-                  </wp:positionH>
-                  <wp:positionV relativeFrom="paragraph">
-                    <wp:posOffset>-32385</wp:posOffset>
-                  </wp:positionV>
-                  <wp:extent cx="1606550" cy="1949450"/>
-                  <wp:effectExtent l="0" t="0" r="0" b="0"/>
-                  <wp:wrapTopAndBottom/>
-                  <wp:docPr id="350509411" name="Picture 5" descr="A green circuit board with wires and wires&#10;&#10;Description automatically generated"/>
-                  <wp:cNvGraphicFramePr>
-                    <a:graphicFrameLocks xmlns:a="http://schemas.openxmlformats.org/drawingml/2006/main" noChangeAspect="1"/>
-                  </wp:cNvGraphicFramePr>
-                  <a:graphic xmlns:a="http://schemas.openxmlformats.org/drawingml/2006/main">
-                    <a:graphicData uri="http://schemas.openxmlformats.org/drawingml/2006/picture">
-                      <pic:pic xmlns:pic="http://schemas.openxmlformats.org/drawingml/2006/picture">
-                        <pic:nvPicPr>
-                          <pic:cNvPr id="350509411" name="Picture 5" descr="A green circuit board with wires and wires&#10;&#10;Description automatically generated"/>
-                          <pic:cNvPicPr/>
-                        </pic:nvPicPr>
-                        <pic:blipFill rotWithShape="1">
-                          <a:blip r:embed="rId21" cstate="print">
-                            <a:extLst>
-                              <a:ext uri="{28A0092B-C50C-407E-A947-70E740481C1C}">
-                                <a14:useLocalDpi xmlns:a14="http://schemas.microsoft.com/office/drawing/2010/main" val="0"/>
-                              </a:ext>
-                            </a:extLst>
-                          </a:blip>
-                          <a:srcRect t="11436" r="10283" b="6916"/>
-                          <a:stretch/>
-                        </pic:blipFill>
-                        <pic:spPr bwMode="auto">
-                          <a:xfrm rot="16200000">
-                            <a:off x="0" y="0"/>
-                            <a:ext cx="1606550" cy="1949450"/>
-                          </a:xfrm>
-                          <a:prstGeom prst="rect">
-                            <a:avLst/>
-                          </a:prstGeom>
-                          <a:ln>
-                            <a:noFill/>
-                          </a:ln>
-                          <a:extLst>
-                            <a:ext uri="{53640926-AAD7-44D8-BBD7-CCE9431645EC}">
-                              <a14:shadowObscured xmlns:a14="http://schemas.microsoft.com/office/drawing/2010/main"/>
-                            </a:ext>
-                          </a:extLst>
-                        </pic:spPr>
-                      </pic:pic>
-                    </a:graphicData>
-                  </a:graphic>
-                  <wp14:sizeRelH relativeFrom="margin">
-                    <wp14:pctWidth>0</wp14:pctWidth>
-                  </wp14:sizeRelH>
-                  <wp14:sizeRelV relativeFrom="margin">
-                    <wp14:pctHeight>0</wp14:pctHeight>
-                  </wp14:sizeRelV>
-                </wp:anchor>
-              </w:drawing>
-            </w:r>
             <w:r>
               <w:rPr>
                 <w:noProof/>
@@ -2151,13 +2047,13 @@
               <mc:AlternateContent>
                 <mc:Choice Requires="wps">
                   <w:drawing>
-                    <wp:anchor distT="0" distB="0" distL="114300" distR="114300" simplePos="0" relativeHeight="251658256" behindDoc="0" locked="0" layoutInCell="1" allowOverlap="1" wp14:anchorId="36F455F9" wp14:editId="15972255">
+                    <wp:anchor distT="0" distB="0" distL="114300" distR="114300" simplePos="0" relativeHeight="251658256" behindDoc="0" locked="0" layoutInCell="1" allowOverlap="1" wp14:anchorId="36F455F9" wp14:editId="1B0A96DC">
                       <wp:simplePos x="0" y="0"/>
                       <wp:positionH relativeFrom="column">
-                        <wp:posOffset>2115820</wp:posOffset>
+                        <wp:posOffset>2181723</wp:posOffset>
                       </wp:positionH>
                       <wp:positionV relativeFrom="paragraph">
-                        <wp:posOffset>437515</wp:posOffset>
+                        <wp:posOffset>305710</wp:posOffset>
                       </wp:positionV>
                       <wp:extent cx="273050" cy="215900"/>
                       <wp:effectExtent l="38100" t="19050" r="12700" b="50800"/>
@@ -2176,7 +2072,7 @@
                               <a:prstGeom prst="straightConnector1">
                                 <a:avLst/>
                               </a:prstGeom>
-                              <a:ln w="28575">
+                              <a:ln w="38100">
                                 <a:solidFill>
                                   <a:srgbClr val="FF0000"/>
                                 </a:solidFill>
@@ -2206,16 +2102,69 @@
                 </mc:Choice>
                 <mc:Fallback>
                   <w:pict>
-                    <v:shapetype w14:anchorId="0DD1425C" id="_x0000_t32" coordsize="21600,21600" o:spt="32" o:oned="t" path="m,l21600,21600e" filled="f">
+                    <v:shapetype w14:anchorId="7E3431CB" id="_x0000_t32" coordsize="21600,21600" o:spt="32" o:oned="t" path="m,l21600,21600e" filled="f">
                       <v:path arrowok="t" fillok="f" o:connecttype="none"/>
                       <o:lock v:ext="edit" shapetype="t"/>
                     </v:shapetype>
-                    <v:shape id="Straight Arrow Connector 20" o:spid="_x0000_s1026" type="#_x0000_t32" style="position:absolute;margin-left:166.6pt;margin-top:34.45pt;width:21.5pt;height:17pt;flip:x;z-index:251658256;visibility:visible;mso-wrap-style:square;mso-wrap-distance-left:9pt;mso-wrap-distance-top:0;mso-wrap-distance-right:9pt;mso-wrap-distance-bottom:0;mso-position-horizontal:absolute;mso-position-horizontal-relative:text;mso-position-vertical:absolute;mso-position-vertical-relative:text" o:gfxdata="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" strokecolor="red" strokeweight="2.25pt">
+                    <v:shape id="Straight Arrow Connector 20" o:spid="_x0000_s1026" type="#_x0000_t32" style="position:absolute;margin-left:171.8pt;margin-top:24.05pt;width:21.5pt;height:17pt;flip:x;z-index:251658256;visibility:visible;mso-wrap-style:square;mso-wrap-distance-left:9pt;mso-wrap-distance-top:0;mso-wrap-distance-right:9pt;mso-wrap-distance-bottom:0;mso-position-horizontal:absolute;mso-position-horizontal-relative:text;mso-position-vertical:absolute;mso-position-vertical-relative:text" o:gfxdata="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" strokecolor="red" strokeweight="3pt">
                       <v:stroke endarrow="block" joinstyle="miter"/>
                     </v:shape>
                   </w:pict>
                 </mc:Fallback>
               </mc:AlternateContent>
+            </w:r>
+            <w:r>
+              <w:rPr>
+                <w:noProof/>
+              </w:rPr>
+              <w:drawing>
+                <wp:inline distT="0" distB="0" distL="0" distR="0" wp14:anchorId="1E735AD8" wp14:editId="2C0E02B9">
+                  <wp:extent cx="2019300" cy="2450465"/>
+                  <wp:effectExtent l="0" t="6033" r="0" b="0"/>
+                  <wp:docPr id="350509411" name="Picture 5" descr="A green circuit board with wires and wires&#10;&#10;Description automatically generated"/>
+                  <wp:cNvGraphicFramePr>
+                    <a:graphicFrameLocks xmlns:a="http://schemas.openxmlformats.org/drawingml/2006/main" noChangeAspect="1"/>
+                  </wp:cNvGraphicFramePr>
+                  <a:graphic xmlns:a="http://schemas.openxmlformats.org/drawingml/2006/main">
+                    <a:graphicData uri="http://schemas.openxmlformats.org/drawingml/2006/picture">
+                      <pic:pic xmlns:pic="http://schemas.openxmlformats.org/drawingml/2006/picture">
+                        <pic:nvPicPr>
+                          <pic:cNvPr id="350509411" name="Picture 5" descr="A green circuit board with wires and wires&#10;&#10;Description automatically generated"/>
+                          <pic:cNvPicPr/>
+                        </pic:nvPicPr>
+                        <pic:blipFill rotWithShape="1">
+                          <a:blip r:embed="rId22" cstate="print">
+                            <a:extLst>
+                              <a:ext uri="{28A0092B-C50C-407E-A947-70E740481C1C}">
+                                <a14:useLocalDpi xmlns:a14="http://schemas.microsoft.com/office/drawing/2010/main" val="0"/>
+                              </a:ext>
+                            </a:extLst>
+                          </a:blip>
+                          <a:srcRect t="11436" r="10283" b="6916"/>
+                          <a:stretch/>
+                        </pic:blipFill>
+                        <pic:spPr bwMode="auto">
+                          <a:xfrm rot="16200000">
+                            <a:off x="0" y="0"/>
+                            <a:ext cx="2019300" cy="2450465"/>
+                          </a:xfrm>
+                          <a:prstGeom prst="rect">
+                            <a:avLst/>
+                          </a:prstGeom>
+                          <a:ln>
+                            <a:noFill/>
+                          </a:ln>
+                          <a:extLst>
+                            <a:ext uri="{53640926-AAD7-44D8-BBD7-CCE9431645EC}">
+                              <a14:shadowObscured xmlns:a14="http://schemas.microsoft.com/office/drawing/2010/main"/>
+                            </a:ext>
+                          </a:extLst>
+                        </pic:spPr>
+                      </pic:pic>
+                    </a:graphicData>
+                  </a:graphic>
+                </wp:inline>
+              </w:drawing>
             </w:r>
           </w:p>
         </w:tc>
@@ -2288,37 +2237,53 @@
           </w:p>
           <w:p>
             <w:pPr>
-              <w:pStyle w:val="ListParagraph"/>
               <w:rPr>
                 <w:sz w:val="24"/>
                 <w:szCs w:val="24"/>
               </w:rPr>
             </w:pPr>
-            <w:r>
-              <w:rPr>
-                <w:sz w:val="24"/>
-                <w:szCs w:val="24"/>
-              </w:rPr>
-              <w:t xml:space="preserve">Now you will see </w:t>
-            </w:r>
-            <w:r>
-              <w:rPr>
-                <w:sz w:val="24"/>
-                <w:szCs w:val="24"/>
-              </w:rPr>
-              <w:t>silver circle with a zig zag</w:t>
-            </w:r>
-            <w:r>
-              <w:rPr>
-                <w:sz w:val="24"/>
-                <w:szCs w:val="24"/>
-              </w:rPr>
-              <w:t xml:space="preserve"> and two very small circles next to it. </w:t>
-            </w:r>
           </w:p>
           <w:p>
             <w:pPr>
-              <w:pStyle w:val="ListParagraph"/>
+              <w:ind w:left="360"/>
+              <w:rPr>
+                <w:sz w:val="24"/>
+                <w:szCs w:val="24"/>
+              </w:rPr>
+            </w:pPr>
+            <w:r>
+              <w:rPr>
+                <w:sz w:val="24"/>
+                <w:szCs w:val="24"/>
+              </w:rPr>
+              <w:t xml:space="preserve">Now you will see </w:t>
+            </w:r>
+            <w:r>
+              <w:rPr>
+                <w:sz w:val="24"/>
+                <w:szCs w:val="24"/>
+              </w:rPr>
+              <w:t>silver circle with a zig zag</w:t>
+            </w:r>
+            <w:r>
+              <w:rPr>
+                <w:sz w:val="24"/>
+                <w:szCs w:val="24"/>
+              </w:rPr>
+              <w:t xml:space="preserve"> and two very small circles next to it. </w:t>
+            </w:r>
+          </w:p>
+          <w:p>
+            <w:pPr>
+              <w:rPr>
+                <w:sz w:val="24"/>
+                <w:szCs w:val="24"/>
+              </w:rPr>
+            </w:pPr>
+          </w:p>
+          <w:p>
+            <w:pPr>
+              <w:ind w:left="360"/>
               <w:rPr>
                 <w:sz w:val="24"/>
                 <w:szCs w:val="24"/>
@@ -2361,16 +2326,16 @@
               <mc:AlternateContent>
                 <mc:Choice Requires="wps">
                   <w:drawing>
-                    <wp:anchor distT="0" distB="0" distL="114300" distR="114300" simplePos="0" relativeHeight="251658247" behindDoc="0" locked="0" layoutInCell="1" allowOverlap="1" wp14:anchorId="69837306" wp14:editId="18220AF2">
+                    <wp:anchor distT="0" distB="0" distL="114300" distR="114300" simplePos="0" relativeHeight="251658247" behindDoc="0" locked="0" layoutInCell="1" allowOverlap="1" wp14:anchorId="69837306" wp14:editId="12797378">
                       <wp:simplePos x="0" y="0"/>
                       <wp:positionH relativeFrom="column">
-                        <wp:posOffset>1388110</wp:posOffset>
+                        <wp:posOffset>1361440</wp:posOffset>
                       </wp:positionH>
                       <wp:positionV relativeFrom="paragraph">
-                        <wp:posOffset>2077085</wp:posOffset>
+                        <wp:posOffset>2032317</wp:posOffset>
                       </wp:positionV>
-                      <wp:extent cx="158750" cy="139700"/>
-                      <wp:effectExtent l="0" t="0" r="12700" b="12700"/>
+                      <wp:extent cx="204787" cy="185737"/>
+                      <wp:effectExtent l="19050" t="19050" r="24130" b="24130"/>
                       <wp:wrapNone/>
                       <wp:docPr id="971310969" name="Flowchart: Connector 11"/>
                       <wp:cNvGraphicFramePr/>
@@ -2381,13 +2346,13 @@
                             <wps:spPr>
                               <a:xfrm>
                                 <a:off x="0" y="0"/>
-                                <a:ext cx="158750" cy="139700"/>
+                                <a:ext cx="204787" cy="185737"/>
                               </a:xfrm>
                               <a:prstGeom prst="flowChartConnector">
                                 <a:avLst/>
                               </a:prstGeom>
                               <a:noFill/>
-                              <a:ln w="19050">
+                              <a:ln w="28575">
                                 <a:solidFill>
                                   <a:srgbClr val="FF0000"/>
                                 </a:solidFill>
@@ -2429,7 +2394,10 @@
                 </mc:Choice>
                 <mc:Fallback>
                   <w:pict>
-                    <v:shape w14:anchorId="4044A9AB" id="Flowchart: Connector 11" o:spid="_x0000_s1026" type="#_x0000_t120" style="position:absolute;margin-left:109.3pt;margin-top:163.55pt;width:12.5pt;height:11pt;z-index:251658247;visibility:visible;mso-wrap-style:square;mso-width-percent:0;mso-height-percent:0;mso-wrap-distance-left:9pt;mso-wrap-distance-top:0;mso-wrap-distance-right:9pt;mso-wrap-distance-bottom:0;mso-position-horizontal:absolute;mso-position-horizontal-relative:text;mso-position-vertical:absolute;mso-position-vertical-relative:text;mso-width-percent:0;mso-height-percent:0;mso-width-relative:margin;mso-height-relative:margin;v-text-anchor:middle" o:gfxdata="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" filled="f" strokecolor="red" strokeweight="1.5pt">
+                    <v:shapetype w14:anchorId="41DEDF20" id="_x0000_t120" coordsize="21600,21600" o:spt="120" path="m10800,qx,10800,10800,21600,21600,10800,10800,xe">
+                      <v:path gradientshapeok="t" o:connecttype="custom" o:connectlocs="10800,0;3163,3163;0,10800;3163,18437;10800,21600;18437,18437;21600,10800;18437,3163" textboxrect="3163,3163,18437,18437"/>
+                    </v:shapetype>
+                    <v:shape id="Flowchart: Connector 11" o:spid="_x0000_s1026" type="#_x0000_t120" style="position:absolute;margin-left:107.2pt;margin-top:160pt;width:16.1pt;height:14.6pt;z-index:251658247;visibility:visible;mso-wrap-style:square;mso-width-percent:0;mso-height-percent:0;mso-wrap-distance-left:9pt;mso-wrap-distance-top:0;mso-wrap-distance-right:9pt;mso-wrap-distance-bottom:0;mso-position-horizontal:absolute;mso-position-horizontal-relative:text;mso-position-vertical:absolute;mso-position-vertical-relative:text;mso-width-percent:0;mso-height-percent:0;mso-width-relative:margin;mso-height-relative:margin;v-text-anchor:middle" o:gfxdata="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" filled="f" strokecolor="red" strokeweight="2.25pt">
                       <v:stroke joinstyle="miter"/>
                     </v:shape>
                   </w:pict>
@@ -2443,16 +2411,16 @@
               <mc:AlternateContent>
                 <mc:Choice Requires="wps">
                   <w:drawing>
-                    <wp:anchor distT="0" distB="0" distL="114300" distR="114300" simplePos="0" relativeHeight="251658248" behindDoc="0" locked="0" layoutInCell="1" allowOverlap="1" wp14:anchorId="05873A97" wp14:editId="0386FC8B">
+                    <wp:anchor distT="0" distB="0" distL="114300" distR="114300" simplePos="0" relativeHeight="251658248" behindDoc="0" locked="0" layoutInCell="1" allowOverlap="1" wp14:anchorId="05873A97" wp14:editId="4B80DC85">
                       <wp:simplePos x="0" y="0"/>
                       <wp:positionH relativeFrom="column">
-                        <wp:posOffset>1529080</wp:posOffset>
+                        <wp:posOffset>1737678</wp:posOffset>
                       </wp:positionH>
                       <wp:positionV relativeFrom="paragraph">
-                        <wp:posOffset>2155825</wp:posOffset>
+                        <wp:posOffset>2132647</wp:posOffset>
                       </wp:positionV>
-                      <wp:extent cx="133350" cy="101600"/>
-                      <wp:effectExtent l="0" t="0" r="19050" b="12700"/>
+                      <wp:extent cx="238125" cy="242887"/>
+                      <wp:effectExtent l="19050" t="19050" r="28575" b="24130"/>
                       <wp:wrapNone/>
                       <wp:docPr id="16465928" name="Flowchart: Connector 12"/>
                       <wp:cNvGraphicFramePr/>
@@ -2463,13 +2431,13 @@
                             <wps:spPr>
                               <a:xfrm>
                                 <a:off x="0" y="0"/>
-                                <a:ext cx="133350" cy="101600"/>
+                                <a:ext cx="238125" cy="242887"/>
                               </a:xfrm>
                               <a:prstGeom prst="flowChartConnector">
                                 <a:avLst/>
                               </a:prstGeom>
                               <a:noFill/>
-                              <a:ln w="19050">
+                              <a:ln w="28575">
                                 <a:solidFill>
                                   <a:srgbClr val="FF0000"/>
                                 </a:solidFill>
@@ -2511,7 +2479,7 @@
                 </mc:Choice>
                 <mc:Fallback>
                   <w:pict>
-                    <v:shape w14:anchorId="4A00FBEF" id="Flowchart: Connector 12" o:spid="_x0000_s1026" type="#_x0000_t120" style="position:absolute;margin-left:120.4pt;margin-top:169.75pt;width:10.5pt;height:8pt;z-index:251658248;visibility:visible;mso-wrap-style:square;mso-width-percent:0;mso-height-percent:0;mso-wrap-distance-left:9pt;mso-wrap-distance-top:0;mso-wrap-distance-right:9pt;mso-wrap-distance-bottom:0;mso-position-horizontal:absolute;mso-position-horizontal-relative:text;mso-position-vertical:absolute;mso-position-vertical-relative:text;mso-width-percent:0;mso-height-percent:0;mso-width-relative:margin;mso-height-relative:margin;v-text-anchor:middle" o:gfxdata="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" filled="f" strokecolor="red" strokeweight="1.5pt">
+                    <v:shape w14:anchorId="3EB86656" id="Flowchart: Connector 12" o:spid="_x0000_s1026" type="#_x0000_t120" style="position:absolute;margin-left:136.85pt;margin-top:167.9pt;width:18.75pt;height:19.1pt;z-index:251658248;visibility:visible;mso-wrap-style:square;mso-width-percent:0;mso-height-percent:0;mso-wrap-distance-left:9pt;mso-wrap-distance-top:0;mso-wrap-distance-right:9pt;mso-wrap-distance-bottom:0;mso-position-horizontal:absolute;mso-position-horizontal-relative:text;mso-position-vertical:absolute;mso-position-vertical-relative:text;mso-width-percent:0;mso-height-percent:0;mso-width-relative:margin;mso-height-relative:margin;v-text-anchor:middle" o:gfxdata="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" filled="f" strokecolor="red" strokeweight="2.25pt">
                       <v:stroke joinstyle="miter"/>
                     </v:shape>
                   </w:pict>
@@ -2538,7 +2506,7 @@
                           <pic:cNvPicPr/>
                         </pic:nvPicPr>
                         <pic:blipFill rotWithShape="1">
-                          <a:blip r:embed="rId22" cstate="print">
+                          <a:blip r:embed="rId23" cstate="print">
                             <a:extLst>
                               <a:ext uri="{28A0092B-C50C-407E-A947-70E740481C1C}">
                                 <a14:useLocalDpi xmlns:a14="http://schemas.microsoft.com/office/drawing/2010/main" val="0"/>
@@ -2614,28 +2582,27 @@
           </w:p>
           <w:p>
             <w:pPr>
-              <w:pStyle w:val="ListParagraph"/>
               <w:rPr>
                 <w:sz w:val="24"/>
                 <w:szCs w:val="24"/>
               </w:rPr>
             </w:pPr>
-            <w:r>
-              <w:rPr>
-                <w:sz w:val="24"/>
-                <w:szCs w:val="24"/>
-              </w:rPr>
-              <w:t xml:space="preserve">To do this, you can gently </w:t>
-            </w:r>
-            <w:proofErr w:type="gramStart"/>
-            <w:r>
-              <w:rPr>
-                <w:sz w:val="24"/>
-                <w:szCs w:val="24"/>
-              </w:rPr>
-              <w:t>add  solder</w:t>
-            </w:r>
-            <w:proofErr w:type="gramEnd"/>
+          </w:p>
+          <w:p>
+            <w:pPr>
+              <w:ind w:left="360"/>
+              <w:rPr>
+                <w:sz w:val="24"/>
+                <w:szCs w:val="24"/>
+              </w:rPr>
+            </w:pPr>
+            <w:r>
+              <w:rPr>
+                <w:sz w:val="24"/>
+                <w:szCs w:val="24"/>
+              </w:rPr>
+              <w:t>To do this, you can gently add  solder</w:t>
+            </w:r>
             <w:r>
               <w:rPr>
                 <w:sz w:val="24"/>
@@ -2672,13 +2639,13 @@
               <mc:AlternateContent>
                 <mc:Choice Requires="wps">
                   <w:drawing>
-                    <wp:anchor distT="0" distB="0" distL="114300" distR="114300" simplePos="0" relativeHeight="251658258" behindDoc="0" locked="0" layoutInCell="1" allowOverlap="1" wp14:anchorId="4335935F" wp14:editId="53E380F0">
+                    <wp:anchor distT="0" distB="0" distL="114300" distR="114300" simplePos="0" relativeHeight="251658258" behindDoc="0" locked="0" layoutInCell="1" allowOverlap="1" wp14:anchorId="4335935F" wp14:editId="3E418F86">
                       <wp:simplePos x="0" y="0"/>
                       <wp:positionH relativeFrom="column">
-                        <wp:posOffset>1709420</wp:posOffset>
+                        <wp:posOffset>1956753</wp:posOffset>
                       </wp:positionH>
                       <wp:positionV relativeFrom="paragraph">
-                        <wp:posOffset>1786890</wp:posOffset>
+                        <wp:posOffset>1805940</wp:posOffset>
                       </wp:positionV>
                       <wp:extent cx="184150" cy="38100"/>
                       <wp:effectExtent l="0" t="57150" r="6350" b="76200"/>
@@ -2727,7 +2694,7 @@
                 </mc:Choice>
                 <mc:Fallback>
                   <w:pict>
-                    <v:shape w14:anchorId="00154210" id="Straight Arrow Connector 24" o:spid="_x0000_s1026" type="#_x0000_t32" style="position:absolute;margin-left:134.6pt;margin-top:140.7pt;width:14.5pt;height:3pt;flip:x;z-index:251697156;visibility:visible;mso-wrap-style:square;mso-wrap-distance-left:9pt;mso-wrap-distance-top:0;mso-wrap-distance-right:9pt;mso-wrap-distance-bottom:0;mso-position-horizontal:absolute;mso-position-horizontal-relative:text;mso-position-vertical:absolute;mso-position-vertical-relative:text" o:gfxdata="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" strokecolor="red" strokeweight="2.25pt">
+                    <v:shape w14:anchorId="51DB38B7" id="Straight Arrow Connector 24" o:spid="_x0000_s1026" type="#_x0000_t32" style="position:absolute;margin-left:154.1pt;margin-top:142.2pt;width:14.5pt;height:3pt;flip:x;z-index:251658258;visibility:visible;mso-wrap-style:square;mso-wrap-distance-left:9pt;mso-wrap-distance-top:0;mso-wrap-distance-right:9pt;mso-wrap-distance-bottom:0;mso-position-horizontal:absolute;mso-position-horizontal-relative:text;mso-position-vertical:absolute;mso-position-vertical-relative:text" o:gfxdata="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" strokecolor="red" strokeweight="2.25pt">
                       <v:stroke endarrow="block" joinstyle="miter"/>
                     </v:shape>
                   </w:pict>
@@ -2831,7 +2798,7 @@
                           <pic:cNvPicPr/>
                         </pic:nvPicPr>
                         <pic:blipFill>
-                          <a:blip r:embed="rId23" cstate="print">
+                          <a:blip r:embed="rId24" cstate="print">
                             <a:extLst>
                               <a:ext uri="{28A0092B-C50C-407E-A947-70E740481C1C}">
                                 <a14:useLocalDpi xmlns:a14="http://schemas.microsoft.com/office/drawing/2010/main" val="0"/>
@@ -3206,7 +3173,7 @@
                           <pic:cNvPicPr/>
                         </pic:nvPicPr>
                         <pic:blipFill>
-                          <a:blip r:embed="rId24" cstate="print">
+                          <a:blip r:embed="rId25" cstate="print">
                             <a:extLst>
                               <a:ext uri="{28A0092B-C50C-407E-A947-70E740481C1C}">
                                 <a14:useLocalDpi xmlns:a14="http://schemas.microsoft.com/office/drawing/2010/main" val="0"/>
@@ -3294,12 +3261,20 @@
           </w:p>
           <w:p>
             <w:pPr>
-              <w:pStyle w:val="ListParagraph"/>
               <w:rPr>
                 <w:sz w:val="24"/>
                 <w:szCs w:val="24"/>
               </w:rPr>
             </w:pPr>
+          </w:p>
+          <w:p>
+            <w:pPr>
+              <w:ind w:left="360"/>
+              <w:rPr>
+                <w:sz w:val="24"/>
+                <w:szCs w:val="24"/>
+              </w:rPr>
+            </w:pPr>
             <w:r>
               <w:rPr>
                 <w:sz w:val="24"/>
@@ -3328,6 +3303,15 @@
               </w:rPr>
               <w:t xml:space="preserve">is not on any spots of the board it should not be. </w:t>
             </w:r>
+          </w:p>
+          <w:p>
+            <w:pPr>
+              <w:ind w:left="360"/>
+              <w:rPr>
+                <w:sz w:val="24"/>
+                <w:szCs w:val="24"/>
+              </w:rPr>
+            </w:pPr>
           </w:p>
           <w:p>
             <w:pPr>
@@ -3427,7 +3411,7 @@
                           <pic:cNvPicPr/>
                         </pic:nvPicPr>
                         <pic:blipFill>
-                          <a:blip r:embed="rId25">
+                          <a:blip r:embed="rId26">
                             <a:extLst>
                               <a:ext uri="{28A0092B-C50C-407E-A947-70E740481C1C}">
                                 <a14:useLocalDpi xmlns:a14="http://schemas.microsoft.com/office/drawing/2010/main" val="0"/>
@@ -3474,31 +3458,67 @@
               </w:numPr>
             </w:pPr>
             <w:r>
+              <w:rPr>
+                <w:sz w:val="24"/>
+                <w:szCs w:val="24"/>
+              </w:rPr>
               <w:lastRenderedPageBreak/>
               <w:t>Y</w:t>
             </w:r>
             <w:r>
+              <w:rPr>
+                <w:sz w:val="24"/>
+                <w:szCs w:val="24"/>
+              </w:rPr>
               <w:t>ou can now prepare to clo</w:t>
             </w:r>
             <w:r>
+              <w:rPr>
+                <w:sz w:val="24"/>
+                <w:szCs w:val="24"/>
+              </w:rPr>
               <w:t>s</w:t>
             </w:r>
             <w:r>
+              <w:rPr>
+                <w:sz w:val="24"/>
+                <w:szCs w:val="24"/>
+              </w:rPr>
               <w:t xml:space="preserve">e the compartment. If possible, you can </w:t>
             </w:r>
             <w:r>
+              <w:rPr>
+                <w:sz w:val="24"/>
+                <w:szCs w:val="24"/>
+              </w:rPr>
               <w:t>put the grey silicone square back on the board, however this may be difficult</w:t>
             </w:r>
             <w:r>
+              <w:rPr>
+                <w:sz w:val="24"/>
+                <w:szCs w:val="24"/>
+              </w:rPr>
               <w:t xml:space="preserve"> as the new wires may be in the way. </w:t>
             </w:r>
             <w:r>
+              <w:rPr>
+                <w:sz w:val="24"/>
+                <w:szCs w:val="24"/>
+              </w:rPr>
               <w:t xml:space="preserve">Add the plastic button back into the compartment, it </w:t>
             </w:r>
             <w:r>
+              <w:rPr>
+                <w:sz w:val="24"/>
+                <w:szCs w:val="24"/>
+              </w:rPr>
               <w:t xml:space="preserve">will no longer activate Bluey if the silicone is not there which is </w:t>
             </w:r>
             <w:r>
+              <w:rPr>
+                <w:sz w:val="24"/>
+                <w:szCs w:val="24"/>
+              </w:rPr>
               <w:t xml:space="preserve">alright as we will now be activating the toy by cable. </w:t>
             </w:r>
           </w:p>
@@ -3509,22 +3529,17 @@
             <w:gridSpan w:val="2"/>
           </w:tcPr>
           <w:p>
+            <w:pPr>
+              <w:jc w:val="center"/>
+            </w:pPr>
             <w:r>
               <w:rPr>
                 <w:noProof/>
               </w:rPr>
               <w:drawing>
-                <wp:anchor distT="0" distB="0" distL="114300" distR="114300" simplePos="0" relativeHeight="251658243" behindDoc="0" locked="0" layoutInCell="1" allowOverlap="1" wp14:anchorId="3D3FA575" wp14:editId="47ED3A3B">
-                  <wp:simplePos x="0" y="0"/>
-                  <wp:positionH relativeFrom="column">
-                    <wp:posOffset>437515</wp:posOffset>
-                  </wp:positionH>
-                  <wp:positionV relativeFrom="paragraph">
-                    <wp:posOffset>12700</wp:posOffset>
-                  </wp:positionV>
-                  <wp:extent cx="2233724" cy="2978150"/>
+                <wp:inline distT="0" distB="0" distL="0" distR="0" wp14:anchorId="3D3FA575" wp14:editId="0D3F008F">
+                  <wp:extent cx="2060300" cy="2746930"/>
                   <wp:effectExtent l="0" t="0" r="0" b="0"/>
-                  <wp:wrapTopAndBottom/>
                   <wp:docPr id="27060179" name="Picture 8" descr="A white device with a black wire&#10;&#10;Description automatically generated"/>
                   <wp:cNvGraphicFramePr>
                     <a:graphicFrameLocks xmlns:a="http://schemas.openxmlformats.org/drawingml/2006/main" noChangeAspect="1"/>
@@ -3537,7 +3552,7 @@
                           <pic:cNvPicPr/>
                         </pic:nvPicPr>
                         <pic:blipFill>
-                          <a:blip r:embed="rId26" cstate="print">
+                          <a:blip r:embed="rId27" cstate="print">
                             <a:extLst>
                               <a:ext uri="{28A0092B-C50C-407E-A947-70E740481C1C}">
                                 <a14:useLocalDpi xmlns:a14="http://schemas.microsoft.com/office/drawing/2010/main" val="0"/>
@@ -3551,7 +3566,7 @@
                         <pic:spPr>
                           <a:xfrm>
                             <a:off x="0" y="0"/>
-                            <a:ext cx="2233724" cy="2978150"/>
+                            <a:ext cx="2062314" cy="2749615"/>
                           </a:xfrm>
                           <a:prstGeom prst="rect">
                             <a:avLst/>
@@ -3560,7 +3575,7 @@
                       </pic:pic>
                     </a:graphicData>
                   </a:graphic>
-                </wp:anchor>
+                </wp:inline>
               </w:drawing>
             </w:r>
           </w:p>
@@ -3582,10 +3597,26 @@
                 <w:ilvl w:val="0"/>
                 <w:numId w:val="3"/>
               </w:numPr>
+              <w:rPr>
+                <w:sz w:val="24"/>
+                <w:szCs w:val="24"/>
+              </w:rPr>
             </w:pPr>
             <w:r>
+              <w:rPr>
+                <w:sz w:val="24"/>
+                <w:szCs w:val="24"/>
+              </w:rPr>
               <w:t xml:space="preserve">Add the screws and close the plastic compartment. </w:t>
             </w:r>
+          </w:p>
+          <w:p>
+            <w:pPr>
+              <w:rPr>
+                <w:sz w:val="24"/>
+                <w:szCs w:val="24"/>
+              </w:rPr>
+            </w:pPr>
           </w:p>
           <w:p>
             <w:pPr>
@@ -3596,51 +3627,115 @@
               </w:numPr>
             </w:pPr>
             <w:r>
+              <w:rPr>
+                <w:sz w:val="24"/>
+                <w:szCs w:val="24"/>
+              </w:rPr>
               <w:t xml:space="preserve">Locate your large </w:t>
             </w:r>
             <w:r>
+              <w:rPr>
+                <w:sz w:val="24"/>
+                <w:szCs w:val="24"/>
+              </w:rPr>
               <w:t>cable</w:t>
             </w:r>
             <w:r>
+              <w:rPr>
+                <w:sz w:val="24"/>
+                <w:szCs w:val="24"/>
+              </w:rPr>
               <w:t xml:space="preserve"> tie and thread it thro</w:t>
             </w:r>
             <w:r>
+              <w:rPr>
+                <w:sz w:val="24"/>
+                <w:szCs w:val="24"/>
+              </w:rPr>
               <w:t xml:space="preserve">ugh </w:t>
             </w:r>
             <w:r>
+              <w:rPr>
+                <w:sz w:val="24"/>
+                <w:szCs w:val="24"/>
+              </w:rPr>
               <w:t>the seam in the fabric</w:t>
             </w:r>
             <w:r>
+              <w:rPr>
+                <w:sz w:val="24"/>
+                <w:szCs w:val="24"/>
+              </w:rPr>
               <w:t>. Add the compartment back into the fabric</w:t>
             </w:r>
             <w:r>
+              <w:rPr>
+                <w:sz w:val="24"/>
+                <w:szCs w:val="24"/>
+              </w:rPr>
               <w:t xml:space="preserve"> and </w:t>
             </w:r>
             <w:r>
+              <w:rPr>
+                <w:sz w:val="24"/>
+                <w:szCs w:val="24"/>
+              </w:rPr>
               <w:t xml:space="preserve">notice the ridge on the plastic compartment which the </w:t>
             </w:r>
             <w:r>
+              <w:rPr>
+                <w:sz w:val="24"/>
+                <w:szCs w:val="24"/>
+              </w:rPr>
               <w:t>cable</w:t>
             </w:r>
             <w:r>
+              <w:rPr>
+                <w:sz w:val="24"/>
+                <w:szCs w:val="24"/>
+              </w:rPr>
               <w:t xml:space="preserve"> tie </w:t>
             </w:r>
             <w:r>
+              <w:rPr>
+                <w:sz w:val="24"/>
+                <w:szCs w:val="24"/>
+              </w:rPr>
               <w:t xml:space="preserve">will </w:t>
             </w:r>
             <w:r>
+              <w:rPr>
+                <w:sz w:val="24"/>
+                <w:szCs w:val="24"/>
+              </w:rPr>
               <w:t xml:space="preserve">go around. </w:t>
             </w:r>
             <w:r>
+              <w:rPr>
+                <w:sz w:val="24"/>
+                <w:szCs w:val="24"/>
+              </w:rPr>
               <w:t>When the compartment and fabric is in place</w:t>
             </w:r>
             <w:r>
+              <w:rPr>
+                <w:sz w:val="24"/>
+                <w:szCs w:val="24"/>
+              </w:rPr>
               <w:t xml:space="preserve">, tighten the </w:t>
             </w:r>
             <w:r>
+              <w:rPr>
+                <w:sz w:val="24"/>
+                <w:szCs w:val="24"/>
+              </w:rPr>
               <w:t>cable</w:t>
             </w:r>
             <w:r>
+              <w:rPr>
+                <w:sz w:val="24"/>
+                <w:szCs w:val="24"/>
+              </w:rPr>
               <w:t xml:space="preserve"> tie so it is secure. </w:t>
             </w:r>
           </w:p>
@@ -3650,24 +3745,18 @@
             <w:tcW w:w="5245" w:type="dxa"/>
             <w:gridSpan w:val="2"/>
           </w:tcPr>
-          <w:p/>
           <w:p>
+            <w:pPr>
+              <w:jc w:val="center"/>
+            </w:pPr>
             <w:r>
               <w:rPr>
                 <w:noProof/>
               </w:rPr>
               <w:drawing>
-                <wp:anchor distT="0" distB="0" distL="114300" distR="114300" simplePos="0" relativeHeight="251658241" behindDoc="0" locked="0" layoutInCell="1" allowOverlap="1" wp14:anchorId="4779E6A9" wp14:editId="6B948B3F">
-                  <wp:simplePos x="0" y="0"/>
-                  <wp:positionH relativeFrom="column">
-                    <wp:posOffset>469265</wp:posOffset>
-                  </wp:positionH>
-                  <wp:positionV relativeFrom="paragraph">
-                    <wp:posOffset>0</wp:posOffset>
-                  </wp:positionV>
-                  <wp:extent cx="2159000" cy="2878455"/>
-                  <wp:effectExtent l="0" t="0" r="0" b="0"/>
-                  <wp:wrapSquare wrapText="bothSides"/>
+                <wp:inline distT="0" distB="0" distL="0" distR="0" wp14:anchorId="4779E6A9" wp14:editId="0D7644ED">
+                  <wp:extent cx="2139880" cy="2224216"/>
+                  <wp:effectExtent l="0" t="0" r="0" b="5080"/>
                   <wp:docPr id="1263667164" name="Picture 9" descr="A hand holding a white bag&#10;&#10;Description automatically generated"/>
                   <wp:cNvGraphicFramePr>
                     <a:graphicFrameLocks xmlns:a="http://schemas.openxmlformats.org/drawingml/2006/main" noChangeAspect="1"/>
@@ -3679,31 +3768,40 @@
                           <pic:cNvPr id="1263667164" name="Picture 9" descr="A hand holding a white bag&#10;&#10;Description automatically generated"/>
                           <pic:cNvPicPr/>
                         </pic:nvPicPr>
-                        <pic:blipFill>
-                          <a:blip r:embed="rId27" cstate="print">
+                        <pic:blipFill rotWithShape="1">
+                          <a:blip r:embed="rId28" cstate="print">
                             <a:extLst>
                               <a:ext uri="{28A0092B-C50C-407E-A947-70E740481C1C}">
                                 <a14:useLocalDpi xmlns:a14="http://schemas.microsoft.com/office/drawing/2010/main" val="0"/>
                               </a:ext>
                             </a:extLst>
                           </a:blip>
+                          <a:srcRect t="22037"/>
                           <a:stretch>
                             <a:fillRect/>
                           </a:stretch>
                         </pic:blipFill>
-                        <pic:spPr>
+                        <pic:spPr bwMode="auto">
                           <a:xfrm>
                             <a:off x="0" y="0"/>
-                            <a:ext cx="2159000" cy="2878455"/>
+                            <a:ext cx="2141869" cy="2226283"/>
                           </a:xfrm>
                           <a:prstGeom prst="rect">
                             <a:avLst/>
                           </a:prstGeom>
+                          <a:ln>
+                            <a:noFill/>
+                          </a:ln>
+                          <a:extLst>
+                            <a:ext uri="{53640926-AAD7-44D8-BBD7-CCE9431645EC}">
+                              <a14:shadowObscured xmlns:a14="http://schemas.microsoft.com/office/drawing/2010/main"/>
+                            </a:ext>
+                          </a:extLst>
                         </pic:spPr>
                       </pic:pic>
                     </a:graphicData>
                   </a:graphic>
-                </wp:anchor>
+                </wp:inline>
               </w:drawing>
             </w:r>
           </w:p>
@@ -3725,10 +3823,24 @@
                 <w:ilvl w:val="0"/>
                 <w:numId w:val="3"/>
               </w:numPr>
+              <w:rPr>
+                <w:sz w:val="24"/>
+                <w:szCs w:val="24"/>
+              </w:rPr>
             </w:pPr>
             <w:r>
-              <w:lastRenderedPageBreak/>
+              <w:rPr>
+                <w:sz w:val="24"/>
+                <w:szCs w:val="24"/>
+              </w:rPr>
               <w:t xml:space="preserve">Put the compartment back inside Bluey and close the Velcro, except for the cable. The cable should be hanging out the back so a switch can be attached for use. </w:t>
+            </w:r>
+            <w:r>
+              <w:rPr>
+                <w:sz w:val="24"/>
+                <w:szCs w:val="24"/>
+              </w:rPr>
+              <w:br/>
             </w:r>
           </w:p>
           <w:p>
@@ -3738,8 +3850,16 @@
                 <w:ilvl w:val="0"/>
                 <w:numId w:val="3"/>
               </w:numPr>
+              <w:rPr>
+                <w:sz w:val="24"/>
+                <w:szCs w:val="24"/>
+              </w:rPr>
             </w:pPr>
             <w:r>
+              <w:rPr>
+                <w:sz w:val="24"/>
+                <w:szCs w:val="24"/>
+              </w:rPr>
               <w:t>If possible, put Bluey back into its original box and seal – toy is complete!</w:t>
             </w:r>
           </w:p>
@@ -3757,22 +3877,17 @@
             <w:gridSpan w:val="2"/>
           </w:tcPr>
           <w:p>
+            <w:pPr>
+              <w:jc w:val="center"/>
+            </w:pPr>
             <w:r>
               <w:rPr>
                 <w:noProof/>
               </w:rPr>
               <w:drawing>
-                <wp:anchor distT="0" distB="0" distL="114300" distR="114300" simplePos="0" relativeHeight="251658242" behindDoc="0" locked="0" layoutInCell="1" allowOverlap="1" wp14:anchorId="373CC063" wp14:editId="35310D9A">
-                  <wp:simplePos x="0" y="0"/>
-                  <wp:positionH relativeFrom="column">
-                    <wp:posOffset>437515</wp:posOffset>
-                  </wp:positionH>
-                  <wp:positionV relativeFrom="paragraph">
-                    <wp:posOffset>44450</wp:posOffset>
-                  </wp:positionV>
-                  <wp:extent cx="2425700" cy="3234104"/>
-                  <wp:effectExtent l="0" t="0" r="0" b="4445"/>
-                  <wp:wrapTopAndBottom/>
+                <wp:inline distT="0" distB="0" distL="0" distR="0" wp14:anchorId="373CC063" wp14:editId="5B84B73B">
+                  <wp:extent cx="2026610" cy="2702011"/>
+                  <wp:effectExtent l="0" t="0" r="0" b="3175"/>
                   <wp:docPr id="844533226" name="Picture 10" descr="A stuffed toy with a microphone&#10;&#10;Description automatically generated"/>
                   <wp:cNvGraphicFramePr>
                     <a:graphicFrameLocks xmlns:a="http://schemas.openxmlformats.org/drawingml/2006/main" noChangeAspect="1"/>
@@ -3785,7 +3900,7 @@
                           <pic:cNvPicPr/>
                         </pic:nvPicPr>
                         <pic:blipFill>
-                          <a:blip r:embed="rId28" cstate="print">
+                          <a:blip r:embed="rId29" cstate="print">
                             <a:extLst>
                               <a:ext uri="{28A0092B-C50C-407E-A947-70E740481C1C}">
                                 <a14:useLocalDpi xmlns:a14="http://schemas.microsoft.com/office/drawing/2010/main" val="0"/>
@@ -3799,7 +3914,7 @@
                         <pic:spPr>
                           <a:xfrm>
                             <a:off x="0" y="0"/>
-                            <a:ext cx="2425700" cy="3234104"/>
+                            <a:ext cx="2028348" cy="2704329"/>
                           </a:xfrm>
                           <a:prstGeom prst="rect">
                             <a:avLst/>
@@ -3808,16 +3923,13 @@
                       </pic:pic>
                     </a:graphicData>
                   </a:graphic>
-                </wp:anchor>
+                </wp:inline>
               </w:drawing>
             </w:r>
           </w:p>
         </w:tc>
       </w:tr>
     </w:tbl>
-    <w:p/>
-    <w:p/>
-    <w:p/>
     <w:p>
       <w:pPr>
         <w:rPr>
@@ -3825,25 +3937,10 @@
           <w:szCs w:val="24"/>
         </w:rPr>
       </w:pPr>
-      <w:r>
-        <w:rPr>
-          <w:sz w:val="24"/>
-          <w:szCs w:val="24"/>
-        </w:rPr>
-        <w:t xml:space="preserve">  </w:t>
-      </w:r>
-    </w:p>
-    <w:p>
-      <w:pPr>
-        <w:rPr>
-          <w:sz w:val="24"/>
-          <w:szCs w:val="24"/>
-        </w:rPr>
-      </w:pPr>
     </w:p>
     <w:sectPr>
-      <w:headerReference w:type="default" r:id="rId29"/>
-      <w:footerReference w:type="default" r:id="rId30"/>
+      <w:headerReference w:type="default" r:id="rId30"/>
+      <w:footerReference w:type="default" r:id="rId31"/>
       <w:pgSz w:w="12240" w:h="15840"/>
       <w:pgMar w:top="1440" w:right="1440" w:bottom="1440" w:left="1440" w:header="720" w:footer="708" w:gutter="0"/>
       <w:cols w:space="708"/>
@@ -4987,7 +5084,7 @@
       <w:lvlText w:val="%1."/>
       <w:lvlJc w:val="left"/>
       <w:pPr>
-        <w:ind w:left="720" w:hanging="360"/>
+        <w:ind w:left="360" w:hanging="360"/>
       </w:pPr>
       <w:rPr>
         <w:sz w:val="24"/>
@@ -5000,7 +5097,7 @@
       <w:lvlText w:val="%2."/>
       <w:lvlJc w:val="left"/>
       <w:pPr>
-        <w:ind w:left="1440" w:hanging="360"/>
+        <w:ind w:left="1080" w:hanging="360"/>
       </w:pPr>
     </w:lvl>
     <w:lvl w:ilvl="2" w:tplc="A628C754">
@@ -5009,7 +5106,7 @@
       <w:lvlText w:val="%3."/>
       <w:lvlJc w:val="right"/>
       <w:pPr>
-        <w:ind w:left="2160" w:hanging="180"/>
+        <w:ind w:left="1800" w:hanging="180"/>
       </w:pPr>
     </w:lvl>
     <w:lvl w:ilvl="3" w:tplc="896A472C">
@@ -5018,7 +5115,7 @@
       <w:lvlText w:val="%4."/>
       <w:lvlJc w:val="left"/>
       <w:pPr>
-        <w:ind w:left="2880" w:hanging="360"/>
+        <w:ind w:left="2520" w:hanging="360"/>
       </w:pPr>
     </w:lvl>
     <w:lvl w:ilvl="4" w:tplc="E6FA84B6">
@@ -5027,7 +5124,7 @@
       <w:lvlText w:val="%5."/>
       <w:lvlJc w:val="left"/>
       <w:pPr>
-        <w:ind w:left="3600" w:hanging="360"/>
+        <w:ind w:left="3240" w:hanging="360"/>
       </w:pPr>
     </w:lvl>
     <w:lvl w:ilvl="5" w:tplc="C8CA777A">
@@ -5036,7 +5133,7 @@
       <w:lvlText w:val="%6."/>
       <w:lvlJc w:val="right"/>
       <w:pPr>
-        <w:ind w:left="4320" w:hanging="180"/>
+        <w:ind w:left="3960" w:hanging="180"/>
       </w:pPr>
     </w:lvl>
     <w:lvl w:ilvl="6" w:tplc="0EECB47C">
@@ -5045,7 +5142,7 @@
       <w:lvlText w:val="%7."/>
       <w:lvlJc w:val="left"/>
       <w:pPr>
-        <w:ind w:left="5040" w:hanging="360"/>
+        <w:ind w:left="4680" w:hanging="360"/>
       </w:pPr>
     </w:lvl>
     <w:lvl w:ilvl="7" w:tplc="6EDC7280">
@@ -5054,7 +5151,7 @@
       <w:lvlText w:val="%8."/>
       <w:lvlJc w:val="left"/>
       <w:pPr>
-        <w:ind w:left="5760" w:hanging="360"/>
+        <w:ind w:left="5400" w:hanging="360"/>
       </w:pPr>
     </w:lvl>
     <w:lvl w:ilvl="8" w:tplc="103E8196">
@@ -5063,7 +5160,7 @@
       <w:lvlText w:val="%9."/>
       <w:lvlJc w:val="right"/>
       <w:pPr>
-        <w:ind w:left="6480" w:hanging="180"/>
+        <w:ind w:left="6120" w:hanging="180"/>
       </w:pPr>
     </w:lvl>
   </w:abstractNum>
@@ -5880,7 +5977,7 @@
       <w:lvlText w:val="%1."/>
       <w:lvlJc w:val="left"/>
       <w:pPr>
-        <w:ind w:left="720" w:hanging="360"/>
+        <w:ind w:left="360" w:hanging="360"/>
       </w:pPr>
     </w:lvl>
     <w:lvl w:ilvl="1" w:tplc="10090019" w:tentative="1">
@@ -5889,7 +5986,7 @@
       <w:lvlText w:val="%2."/>
       <w:lvlJc w:val="left"/>
       <w:pPr>
-        <w:ind w:left="1440" w:hanging="360"/>
+        <w:ind w:left="1080" w:hanging="360"/>
       </w:pPr>
     </w:lvl>
     <w:lvl w:ilvl="2" w:tplc="1009001B" w:tentative="1">
@@ -5898,7 +5995,7 @@
       <w:lvlText w:val="%3."/>
       <w:lvlJc w:val="right"/>
       <w:pPr>
-        <w:ind w:left="2160" w:hanging="180"/>
+        <w:ind w:left="1800" w:hanging="180"/>
       </w:pPr>
     </w:lvl>
     <w:lvl w:ilvl="3" w:tplc="1009000F" w:tentative="1">
@@ -5907,7 +6004,7 @@
       <w:lvlText w:val="%4."/>
       <w:lvlJc w:val="left"/>
       <w:pPr>
-        <w:ind w:left="2880" w:hanging="360"/>
+        <w:ind w:left="2520" w:hanging="360"/>
       </w:pPr>
     </w:lvl>
     <w:lvl w:ilvl="4" w:tplc="10090019" w:tentative="1">
@@ -5916,7 +6013,7 @@
       <w:lvlText w:val="%5."/>
       <w:lvlJc w:val="left"/>
       <w:pPr>
-        <w:ind w:left="3600" w:hanging="360"/>
+        <w:ind w:left="3240" w:hanging="360"/>
       </w:pPr>
     </w:lvl>
     <w:lvl w:ilvl="5" w:tplc="1009001B" w:tentative="1">
@@ -5925,7 +6022,7 @@
       <w:lvlText w:val="%6."/>
       <w:lvlJc w:val="right"/>
       <w:pPr>
-        <w:ind w:left="4320" w:hanging="180"/>
+        <w:ind w:left="3960" w:hanging="180"/>
       </w:pPr>
     </w:lvl>
     <w:lvl w:ilvl="6" w:tplc="1009000F" w:tentative="1">
@@ -5934,7 +6031,7 @@
       <w:lvlText w:val="%7."/>
       <w:lvlJc w:val="left"/>
       <w:pPr>
-        <w:ind w:left="5040" w:hanging="360"/>
+        <w:ind w:left="4680" w:hanging="360"/>
       </w:pPr>
     </w:lvl>
     <w:lvl w:ilvl="7" w:tplc="10090019" w:tentative="1">
@@ -5943,7 +6040,7 @@
       <w:lvlText w:val="%8."/>
       <w:lvlJc w:val="left"/>
       <w:pPr>
-        <w:ind w:left="5760" w:hanging="360"/>
+        <w:ind w:left="5400" w:hanging="360"/>
       </w:pPr>
     </w:lvl>
     <w:lvl w:ilvl="8" w:tplc="1009001B" w:tentative="1">
@@ -5952,7 +6049,7 @@
       <w:lvlText w:val="%9."/>
       <w:lvlJc w:val="right"/>
       <w:pPr>
-        <w:ind w:left="6480" w:hanging="180"/>
+        <w:ind w:left="6120" w:hanging="180"/>
       </w:pPr>
     </w:lvl>
   </w:abstractNum>
@@ -7824,6 +7921,18 @@
       <w:szCs w:val="24"/>
     </w:rPr>
   </w:style>
+  <w:style w:type="character" w:styleId="UnresolvedMention">
+    <w:name w:val="Unresolved Mention"/>
+    <w:basedOn w:val="DefaultParagraphFont"/>
+    <w:uiPriority w:val="99"/>
+    <w:semiHidden/>
+    <w:unhideWhenUsed/>
+    <w:rsid w:val="006A7194"/>
+    <w:rPr>
+      <w:color w:val="605E5C"/>
+      <w:shd w:val="clear" w:color="auto" w:fill="E1DFDD"/>
+    </w:rPr>
+  </w:style>
 </w:styles>
 </file>
 
@@ -8089,8 +8198,28 @@
 </file>
 
 <file path=customXml/item1.xml><?xml version="1.0" encoding="utf-8"?>
-<ct:contentTypeSchema xmlns:ct="http://schemas.microsoft.com/office/2006/metadata/contentType" xmlns:ma="http://schemas.microsoft.com/office/2006/metadata/properties/metaAttributes" ct:_="" ma:_="" ma:contentTypeName="Document" ma:contentTypeID="0x010100456CAEA290209545A9F8681F83603874" ma:contentTypeVersion="19" ma:contentTypeDescription="Create a new document." ma:contentTypeScope="" ma:versionID="4bf10bb897fc0ef406baa02b9d664253">
-  <xsd:schema xmlns:xsd="http://www.w3.org/2001/XMLSchema" xmlns:xs="http://www.w3.org/2001/XMLSchema" xmlns:p="http://schemas.microsoft.com/office/2006/metadata/properties" xmlns:ns2="8cf100d1-0775-4feb-8634-62999c4541bc" xmlns:ns3="38b325e6-602c-452a-8617-173bf47082c5" targetNamespace="http://schemas.microsoft.com/office/2006/metadata/properties" ma:root="true" ma:fieldsID="1c6be4edf2b996d6a6f54fa7c1dd8d7b" ns2:_="" ns3:_="">
+<?mso-contentType ?>
+<FormTemplates xmlns="http://schemas.microsoft.com/sharepoint/v3/contenttype/forms">
+  <Display>DocumentLibraryForm</Display>
+  <Edit>DocumentLibraryForm</Edit>
+  <New>DocumentLibraryForm</New>
+</FormTemplates>
+</file>
+
+<file path=customXml/item2.xml><?xml version="1.0" encoding="utf-8"?>
+<p:properties xmlns:p="http://schemas.microsoft.com/office/2006/metadata/properties" xmlns:xsi="http://www.w3.org/2001/XMLSchema-instance" xmlns:pc="http://schemas.microsoft.com/office/infopath/2007/PartnerControls">
+  <documentManagement>
+    <TaxCatchAll xmlns="38b325e6-602c-452a-8617-173bf47082c5" xsi:nil="true"/>
+    <lcf76f155ced4ddcb4097134ff3c332f xmlns="8cf100d1-0775-4feb-8634-62999c4541bc">
+      <Terms xmlns="http://schemas.microsoft.com/office/infopath/2007/PartnerControls"/>
+    </lcf76f155ced4ddcb4097134ff3c332f>
+  </documentManagement>
+</p:properties>
+</file>
+
+<file path=customXml/item3.xml><?xml version="1.0" encoding="utf-8"?>
+<ct:contentTypeSchema xmlns:ct="http://schemas.microsoft.com/office/2006/metadata/contentType" xmlns:ma="http://schemas.microsoft.com/office/2006/metadata/properties/metaAttributes" ct:_="" ma:_="" ma:contentTypeName="Document" ma:contentTypeID="0x010100456CAEA290209545A9F8681F83603874" ma:contentTypeVersion="19" ma:contentTypeDescription="Create a new document." ma:contentTypeScope="" ma:versionID="a5b95c81d0183cd265e4c0ae7d195efc">
+  <xsd:schema xmlns:xsd="http://www.w3.org/2001/XMLSchema" xmlns:xs="http://www.w3.org/2001/XMLSchema" xmlns:p="http://schemas.microsoft.com/office/2006/metadata/properties" xmlns:ns2="8cf100d1-0775-4feb-8634-62999c4541bc" xmlns:ns3="38b325e6-602c-452a-8617-173bf47082c5" targetNamespace="http://schemas.microsoft.com/office/2006/metadata/properties" ma:root="true" ma:fieldsID="39769bd7f15653c282ab5152dbadbd81" ns2:_="" ns3:_="">
     <xsd:import namespace="8cf100d1-0775-4feb-8634-62999c4541bc"/>
     <xsd:import namespace="38b325e6-602c-452a-8617-173bf47082c5"/>
     <xsd:element name="properties">
@@ -8343,45 +8472,14 @@
 </ct:contentTypeSchema>
 </file>
 
-<file path=customXml/item2.xml><?xml version="1.0" encoding="utf-8"?>
-<p:properties xmlns:p="http://schemas.microsoft.com/office/2006/metadata/properties" xmlns:xsi="http://www.w3.org/2001/XMLSchema-instance" xmlns:pc="http://schemas.microsoft.com/office/infopath/2007/PartnerControls">
-  <documentManagement>
-    <TaxCatchAll xmlns="38b325e6-602c-452a-8617-173bf47082c5" xsi:nil="true"/>
-    <lcf76f155ced4ddcb4097134ff3c332f xmlns="8cf100d1-0775-4feb-8634-62999c4541bc">
-      <Terms xmlns="http://schemas.microsoft.com/office/infopath/2007/PartnerControls"/>
-    </lcf76f155ced4ddcb4097134ff3c332f>
-  </documentManagement>
-</p:properties>
-</file>
-
-<file path=customXml/item3.xml><?xml version="1.0" encoding="utf-8"?>
-<?mso-contentType ?>
-<FormTemplates xmlns="http://schemas.microsoft.com/sharepoint/v3/contenttype/forms">
-  <Display>DocumentLibraryForm</Display>
-  <Edit>DocumentLibraryForm</Edit>
-  <New>DocumentLibraryForm</New>
-</FormTemplates>
-</file>
-
 <file path=customXml/item4.xml><?xml version="1.0" encoding="utf-8"?>
 <b:Sources xmlns:b="http://schemas.openxmlformats.org/officeDocument/2006/bibliography" xmlns="http://schemas.openxmlformats.org/officeDocument/2006/bibliography" SelectedStyle="\APASixthEditionOfficeOnline.xsl" StyleName="APA" Version="6"/>
 </file>
 
 <file path=customXml/itemProps1.xml><?xml version="1.0" encoding="utf-8"?>
-<ds:datastoreItem xmlns:ds="http://schemas.openxmlformats.org/officeDocument/2006/customXml" ds:itemID="{95BFDF57-B7B3-4C1A-A92D-741324F3A0C3}">
+<ds:datastoreItem xmlns:ds="http://schemas.openxmlformats.org/officeDocument/2006/customXml" ds:itemID="{2585761D-1AE9-4796-83E7-A2FC381967AF}">
   <ds:schemaRefs>
-    <ds:schemaRef ds:uri="http://schemas.microsoft.com/office/2006/metadata/contentType"/>
-    <ds:schemaRef ds:uri="http://schemas.microsoft.com/office/2006/metadata/properties/metaAttributes"/>
-    <ds:schemaRef ds:uri="http://www.w3.org/2001/XMLSchema"/>
-    <ds:schemaRef ds:uri="http://schemas.microsoft.com/office/2006/metadata/properties"/>
-    <ds:schemaRef ds:uri="8cf100d1-0775-4feb-8634-62999c4541bc"/>
-    <ds:schemaRef ds:uri="38b325e6-602c-452a-8617-173bf47082c5"/>
-    <ds:schemaRef ds:uri="http://schemas.microsoft.com/office/2006/documentManagement/types"/>
-    <ds:schemaRef ds:uri="http://schemas.microsoft.com/office/infopath/2007/PartnerControls"/>
-    <ds:schemaRef ds:uri="http://schemas.openxmlformats.org/package/2006/metadata/core-properties"/>
-    <ds:schemaRef ds:uri="http://purl.org/dc/elements/1.1/"/>
-    <ds:schemaRef ds:uri="http://purl.org/dc/terms/"/>
-    <ds:schemaRef ds:uri="http://schemas.microsoft.com/internal/obd"/>
+    <ds:schemaRef ds:uri="http://schemas.microsoft.com/sharepoint/v3/contenttype/forms"/>
   </ds:schemaRefs>
 </ds:datastoreItem>
 </file>
@@ -8389,26 +8487,16 @@
 <file path=customXml/itemProps2.xml><?xml version="1.0" encoding="utf-8"?>
 <ds:datastoreItem xmlns:ds="http://schemas.openxmlformats.org/officeDocument/2006/customXml" ds:itemID="{3A085C18-819E-4466-9494-DD461C39C2B0}">
   <ds:schemaRefs>
-    <ds:schemaRef ds:uri="http://schemas.microsoft.com/office/2006/documentManagement/types"/>
-    <ds:schemaRef ds:uri="http://purl.org/dc/elements/1.1/"/>
-    <ds:schemaRef ds:uri="http://www.w3.org/XML/1998/namespace"/>
+    <ds:schemaRef ds:uri="http://schemas.microsoft.com/office/2006/metadata/properties"/>
     <ds:schemaRef ds:uri="http://schemas.microsoft.com/office/infopath/2007/PartnerControls"/>
-    <ds:schemaRef ds:uri="http://schemas.openxmlformats.org/package/2006/metadata/core-properties"/>
-    <ds:schemaRef ds:uri="http://purl.org/dc/dcmitype/"/>
-    <ds:schemaRef ds:uri="http://purl.org/dc/terms/"/>
     <ds:schemaRef ds:uri="38b325e6-602c-452a-8617-173bf47082c5"/>
     <ds:schemaRef ds:uri="8cf100d1-0775-4feb-8634-62999c4541bc"/>
-    <ds:schemaRef ds:uri="http://schemas.microsoft.com/office/2006/metadata/properties"/>
   </ds:schemaRefs>
 </ds:datastoreItem>
 </file>
 
 <file path=customXml/itemProps3.xml><?xml version="1.0" encoding="utf-8"?>
-<ds:datastoreItem xmlns:ds="http://schemas.openxmlformats.org/officeDocument/2006/customXml" ds:itemID="{2585761D-1AE9-4796-83E7-A2FC381967AF}">
-  <ds:schemaRefs>
-    <ds:schemaRef ds:uri="http://schemas.microsoft.com/sharepoint/v3/contenttype/forms"/>
-  </ds:schemaRefs>
-</ds:datastoreItem>
+<ds:datastoreItem xmlns:ds="http://schemas.openxmlformats.org/officeDocument/2006/customXml" ds:itemID="{79967CE6-C171-41C3-B19E-DF3015D3EDFB}"/>
 </file>
 
 <file path=customXml/itemProps4.xml><?xml version="1.0" encoding="utf-8"?>

</xml_diff>